<commit_message>
fix: encabezados en Arial negro (fuente normal, no Arial Black)
Se revierte la fuente mayor del tema a Arial y se cambia el color
de los estilos Title/Subtitle/Heading1-9 a negro en la plantilla
de referencia; antes heredaban el azul accent1 del tema.
</commit_message>
<xml_diff>
--- a/pandoc/reference.docx
+++ b/pandoc/reference.docx
@@ -542,6 +542,7 @@
       <w:rFonts w:asciiTheme="majorHAnsi" w:eastAsiaTheme="majorEastAsia" w:hAnsiTheme="majorHAnsi" w:cstheme="majorBidi"/>
       <w:sz w:val="56"/>
       <w:szCs w:val="56"/>
+      <w:color w:val="000000"/>
     </w:rPr>
   </w:style>
   <w:style w:type="character" w:customStyle="1" w:styleId="TitleChar">
@@ -574,6 +575,7 @@
       <w:spacing w:val="15"/>
       <w:sz w:val="28"/>
       <w:szCs w:val="28"/>
+      <w:color w:val="000000"/>
     </w:rPr>
   </w:style>
   <w:style w:type="character" w:customStyle="1" w:styleId="SubtitleChar">
@@ -674,7 +676,7 @@
     </w:pPr>
     <w:rPr>
       <w:rFonts w:asciiTheme="majorHAnsi" w:eastAsiaTheme="majorEastAsia" w:hAnsiTheme="majorHAnsi" w:cstheme="majorBidi"/>
-      <w:color w:val="0F4761" w:themeColor="accent1" w:themeShade="BF"/>
+      <w:color w:val="000000"/>
       <w:sz w:val="40"/>
       <w:szCs w:val="40"/>
     </w:rPr>
@@ -697,7 +699,7 @@
     </w:pPr>
     <w:rPr>
       <w:rFonts w:asciiTheme="majorHAnsi" w:eastAsiaTheme="majorEastAsia" w:hAnsiTheme="majorHAnsi" w:cstheme="majorBidi"/>
-      <w:color w:val="0F4761" w:themeColor="accent1" w:themeShade="BF"/>
+      <w:color w:val="000000"/>
       <w:sz w:val="32"/>
       <w:szCs w:val="32"/>
     </w:rPr>
@@ -720,7 +722,7 @@
     </w:pPr>
     <w:rPr>
       <w:rFonts w:eastAsiaTheme="majorEastAsia" w:cstheme="majorBidi"/>
-      <w:color w:val="0F4761" w:themeColor="accent1" w:themeShade="BF"/>
+      <w:color w:val="000000"/>
       <w:sz w:val="28"/>
       <w:szCs w:val="28"/>
     </w:rPr>
@@ -745,7 +747,7 @@
       <w:rFonts w:eastAsiaTheme="majorEastAsia" w:cstheme="majorBidi"/>
       <w:i/>
       <w:iCs/>
-      <w:color w:val="0F4761" w:themeColor="accent1" w:themeShade="BF"/>
+      <w:color w:val="000000"/>
     </w:rPr>
   </w:style>
   <w:style w:type="paragraph" w:styleId="Heading5">
@@ -766,7 +768,7 @@
     </w:pPr>
     <w:rPr>
       <w:rFonts w:eastAsiaTheme="majorEastAsia" w:cstheme="majorBidi"/>
-      <w:color w:val="0F4761" w:themeColor="accent1" w:themeShade="BF"/>
+      <w:color w:val="000000"/>
     </w:rPr>
   </w:style>
   <w:style w:type="paragraph" w:styleId="Heading6">
@@ -789,7 +791,7 @@
       <w:rFonts w:eastAsiaTheme="majorEastAsia" w:cstheme="majorBidi"/>
       <w:i/>
       <w:iCs/>
-      <w:color w:val="595959" w:themeColor="text1" w:themeTint="A6"/>
+      <w:color w:val="000000"/>
     </w:rPr>
   </w:style>
   <w:style w:type="paragraph" w:styleId="Heading7">
@@ -810,7 +812,7 @@
     </w:pPr>
     <w:rPr>
       <w:rFonts w:eastAsiaTheme="majorEastAsia" w:cstheme="majorBidi"/>
-      <w:color w:val="595959" w:themeColor="text1" w:themeTint="A6"/>
+      <w:color w:val="000000"/>
     </w:rPr>
   </w:style>
   <w:style w:type="paragraph" w:styleId="Heading8">
@@ -833,7 +835,7 @@
       <w:rFonts w:eastAsiaTheme="majorEastAsia" w:cstheme="majorBidi"/>
       <w:i/>
       <w:iCs/>
-      <w:color w:val="272727" w:themeColor="text1" w:themeTint="D8"/>
+      <w:color w:val="000000"/>
     </w:rPr>
   </w:style>
   <w:style w:type="paragraph" w:styleId="Heading9">
@@ -854,7 +856,7 @@
     </w:pPr>
     <w:rPr>
       <w:rFonts w:eastAsiaTheme="majorEastAsia" w:cstheme="majorBidi"/>
-      <w:color w:val="272727" w:themeColor="text1" w:themeTint="D8"/>
+      <w:color w:val="000000"/>
     </w:rPr>
   </w:style>
   <w:style w:type="character" w:customStyle="1" w:styleId="Heading1Char">
@@ -1182,7 +1184,7 @@
     </a:clrScheme>
     <a:fontScheme name="Office">
       <a:majorFont>
-        <a:latin typeface="Arial Black"/>
+        <a:latin typeface="Arial" panose="020B0604020202020204"/>
         <a:ea typeface=""/>
         <a:cs typeface=""/>
         <a:font script="Jpan" typeface="游ゴシック Light"/>

</xml_diff>